<commit_message>
skapade div för header, men saknar css
</commit_message>
<xml_diff>
--- a/dokumentation/Projektplan_tidapp.docx
+++ b/dokumentation/Projektplan_tidapp.docx
@@ -267,21 +267,7 @@
                 <w:rStyle w:val="Hyperlnk"/>
                 <w:noProof/>
               </w:rPr>
-              <w:t>Projektb</w:t>
-            </w:r>
-            <w:r>
-              <w:rPr>
-                <w:rStyle w:val="Hyperlnk"/>
-                <w:noProof/>
-              </w:rPr>
-              <w:t>e</w:t>
-            </w:r>
-            <w:r>
-              <w:rPr>
-                <w:rStyle w:val="Hyperlnk"/>
-                <w:noProof/>
-              </w:rPr>
-              <w:t>skrivning</w:t>
+              <w:t>Projektbeskrivning</w:t>
             </w:r>
             <w:r>
               <w:rPr>
@@ -1646,10 +1632,12 @@
         <w:t xml:space="preserve">i många sammanhang behöver man kunna redovisa hur länge man gjort olika uppgifter för </w:t>
       </w:r>
       <w:proofErr w:type="spellStart"/>
+      <w:proofErr w:type="gramStart"/>
       <w:r>
         <w:t>t.ex</w:t>
       </w:r>
       <w:proofErr w:type="spellEnd"/>
+      <w:proofErr w:type="gramEnd"/>
       <w:r>
         <w:t xml:space="preserve"> kunna fakturera kunder eller visa för en arbetsgivare vad man gjort under en viss tid.</w:t>
       </w:r>
@@ -1869,6 +1857,7 @@
       </w:pPr>
       <w:bookmarkStart w:id="6" w:name="_Toc103152773"/>
       <w:r>
+        <w:lastRenderedPageBreak/>
         <w:t>Gränssnittet</w:t>
       </w:r>
       <w:bookmarkEnd w:id="6"/>
@@ -1884,35 +1873,354 @@
       <w:bookmarkEnd w:id="7"/>
     </w:p>
     <w:p>
-      <w:r>
-        <w:t>Hur ska de olika skärmbilderna i programmet se ut</w:t>
-      </w:r>
-      <w:r>
-        <w:t>?</w:t>
+      <w:pPr>
+        <w:keepNext/>
+      </w:pPr>
+      <w:r>
+        <w:rPr>
+          <w:noProof/>
+        </w:rPr>
+        <w:drawing>
+          <wp:inline distT="0" distB="0" distL="0" distR="0" wp14:anchorId="1AEA5FEA" wp14:editId="1DD7B5C5">
+            <wp:extent cx="5471160" cy="4404360"/>
+            <wp:effectExtent l="0" t="0" r="0" b="0"/>
+            <wp:docPr id="75710753" name="Bildobjekt 1"/>
+            <wp:cNvGraphicFramePr>
+              <a:graphicFrameLocks xmlns:a="http://schemas.openxmlformats.org/drawingml/2006/main" noChangeAspect="1"/>
+            </wp:cNvGraphicFramePr>
+            <a:graphic xmlns:a="http://schemas.openxmlformats.org/drawingml/2006/main">
+              <a:graphicData uri="http://schemas.openxmlformats.org/drawingml/2006/picture">
+                <pic:pic xmlns:pic="http://schemas.openxmlformats.org/drawingml/2006/picture">
+                  <pic:nvPicPr>
+                    <pic:cNvPr id="0" name="Picture 1"/>
+                    <pic:cNvPicPr>
+                      <a:picLocks noChangeAspect="1" noChangeArrowheads="1"/>
+                    </pic:cNvPicPr>
+                  </pic:nvPicPr>
+                  <pic:blipFill>
+                    <a:blip r:embed="rId13">
+                      <a:extLst>
+                        <a:ext uri="{28A0092B-C50C-407E-A947-70E740481C1C}">
+                          <a14:useLocalDpi xmlns:a14="http://schemas.microsoft.com/office/drawing/2010/main" val="0"/>
+                        </a:ext>
+                      </a:extLst>
+                    </a:blip>
+                    <a:srcRect/>
+                    <a:stretch>
+                      <a:fillRect/>
+                    </a:stretch>
+                  </pic:blipFill>
+                  <pic:spPr bwMode="auto">
+                    <a:xfrm>
+                      <a:off x="0" y="0"/>
+                      <a:ext cx="5471160" cy="4404360"/>
+                    </a:xfrm>
+                    <a:prstGeom prst="rect">
+                      <a:avLst/>
+                    </a:prstGeom>
+                    <a:noFill/>
+                    <a:ln>
+                      <a:noFill/>
+                    </a:ln>
+                  </pic:spPr>
+                </pic:pic>
+              </a:graphicData>
+            </a:graphic>
+          </wp:inline>
+        </w:drawing>
       </w:r>
     </w:p>
     <w:p>
       <w:pPr>
+        <w:pStyle w:val="Beskrivning"/>
+      </w:pPr>
+      <w:r>
+        <w:fldChar w:fldCharType="begin"/>
+      </w:r>
+      <w:r>
+        <w:instrText xml:space="preserve"> SEQ Figur \* ARABIC </w:instrText>
+      </w:r>
+      <w:r>
+        <w:fldChar w:fldCharType="separate"/>
+      </w:r>
+      <w:r>
+        <w:rPr>
+          <w:noProof/>
+        </w:rPr>
+        <w:t>1</w:t>
+      </w:r>
+      <w:r>
+        <w:fldChar w:fldCharType="end"/>
+      </w:r>
+      <w:r>
+        <w:t xml:space="preserve"> – Sammanfattningsbild</w:t>
+      </w:r>
+    </w:p>
+    <w:p/>
+    <w:p>
+      <w:pPr>
+        <w:keepNext/>
+      </w:pPr>
+      <w:r>
+        <w:rPr>
+          <w:noProof/>
+        </w:rPr>
+        <w:lastRenderedPageBreak/>
+        <w:drawing>
+          <wp:inline distT="0" distB="0" distL="0" distR="0" wp14:anchorId="266543BD" wp14:editId="37590CC9">
+            <wp:extent cx="5471160" cy="4709160"/>
+            <wp:effectExtent l="0" t="0" r="0" b="0"/>
+            <wp:docPr id="1909998212" name="Bildobjekt 2"/>
+            <wp:cNvGraphicFramePr>
+              <a:graphicFrameLocks xmlns:a="http://schemas.openxmlformats.org/drawingml/2006/main" noChangeAspect="1"/>
+            </wp:cNvGraphicFramePr>
+            <a:graphic xmlns:a="http://schemas.openxmlformats.org/drawingml/2006/main">
+              <a:graphicData uri="http://schemas.openxmlformats.org/drawingml/2006/picture">
+                <pic:pic xmlns:pic="http://schemas.openxmlformats.org/drawingml/2006/picture">
+                  <pic:nvPicPr>
+                    <pic:cNvPr id="0" name="Picture 2"/>
+                    <pic:cNvPicPr>
+                      <a:picLocks noChangeAspect="1" noChangeArrowheads="1"/>
+                    </pic:cNvPicPr>
+                  </pic:nvPicPr>
+                  <pic:blipFill>
+                    <a:blip r:embed="rId14">
+                      <a:extLst>
+                        <a:ext uri="{28A0092B-C50C-407E-A947-70E740481C1C}">
+                          <a14:useLocalDpi xmlns:a14="http://schemas.microsoft.com/office/drawing/2010/main" val="0"/>
+                        </a:ext>
+                      </a:extLst>
+                    </a:blip>
+                    <a:srcRect/>
+                    <a:stretch>
+                      <a:fillRect/>
+                    </a:stretch>
+                  </pic:blipFill>
+                  <pic:spPr bwMode="auto">
+                    <a:xfrm>
+                      <a:off x="0" y="0"/>
+                      <a:ext cx="5471160" cy="4709160"/>
+                    </a:xfrm>
+                    <a:prstGeom prst="rect">
+                      <a:avLst/>
+                    </a:prstGeom>
+                    <a:noFill/>
+                    <a:ln>
+                      <a:noFill/>
+                    </a:ln>
+                  </pic:spPr>
+                </pic:pic>
+              </a:graphicData>
+            </a:graphic>
+          </wp:inline>
+        </w:drawing>
+      </w:r>
+    </w:p>
+    <w:p>
+      <w:pPr>
+        <w:pStyle w:val="Beskrivning"/>
+      </w:pPr>
+      <w:r>
+        <w:fldChar w:fldCharType="begin"/>
+      </w:r>
+      <w:r>
+        <w:instrText xml:space="preserve"> SEQ Figur \* ARABIC </w:instrText>
+      </w:r>
+      <w:r>
+        <w:fldChar w:fldCharType="separate"/>
+      </w:r>
+      <w:r>
+        <w:rPr>
+          <w:noProof/>
+        </w:rPr>
+        <w:t>2</w:t>
+      </w:r>
+      <w:r>
+        <w:fldChar w:fldCharType="end"/>
+      </w:r>
+      <w:r>
+        <w:t xml:space="preserve"> – Uppgiftsbilden</w:t>
+      </w:r>
+    </w:p>
+    <w:p/>
+    <w:p>
+      <w:pPr>
+        <w:keepNext/>
+      </w:pPr>
+      <w:r>
+        <w:rPr>
+          <w:noProof/>
+        </w:rPr>
+        <w:lastRenderedPageBreak/>
+        <w:drawing>
+          <wp:inline distT="0" distB="0" distL="0" distR="0" wp14:anchorId="1CDB85BC" wp14:editId="0A25CC7F">
+            <wp:extent cx="5478780" cy="3482975"/>
+            <wp:effectExtent l="0" t="0" r="7620" b="3175"/>
+            <wp:docPr id="1650055501" name="Bildobjekt 3"/>
+            <wp:cNvGraphicFramePr>
+              <a:graphicFrameLocks xmlns:a="http://schemas.openxmlformats.org/drawingml/2006/main" noChangeAspect="1"/>
+            </wp:cNvGraphicFramePr>
+            <a:graphic xmlns:a="http://schemas.openxmlformats.org/drawingml/2006/main">
+              <a:graphicData uri="http://schemas.openxmlformats.org/drawingml/2006/picture">
+                <pic:pic xmlns:pic="http://schemas.openxmlformats.org/drawingml/2006/picture">
+                  <pic:nvPicPr>
+                    <pic:cNvPr id="0" name="Picture 3"/>
+                    <pic:cNvPicPr>
+                      <a:picLocks noChangeAspect="1" noChangeArrowheads="1"/>
+                    </pic:cNvPicPr>
+                  </pic:nvPicPr>
+                  <pic:blipFill>
+                    <a:blip r:embed="rId15">
+                      <a:extLst>
+                        <a:ext uri="{28A0092B-C50C-407E-A947-70E740481C1C}">
+                          <a14:useLocalDpi xmlns:a14="http://schemas.microsoft.com/office/drawing/2010/main" val="0"/>
+                        </a:ext>
+                      </a:extLst>
+                    </a:blip>
+                    <a:srcRect/>
+                    <a:stretch>
+                      <a:fillRect/>
+                    </a:stretch>
+                  </pic:blipFill>
+                  <pic:spPr bwMode="auto">
+                    <a:xfrm>
+                      <a:off x="0" y="0"/>
+                      <a:ext cx="5478780" cy="3482975"/>
+                    </a:xfrm>
+                    <a:prstGeom prst="rect">
+                      <a:avLst/>
+                    </a:prstGeom>
+                    <a:noFill/>
+                    <a:ln>
+                      <a:noFill/>
+                    </a:ln>
+                  </pic:spPr>
+                </pic:pic>
+              </a:graphicData>
+            </a:graphic>
+          </wp:inline>
+        </w:drawing>
+      </w:r>
+    </w:p>
+    <w:p>
+      <w:pPr>
+        <w:pStyle w:val="Beskrivning"/>
+      </w:pPr>
+      <w:r>
+        <w:fldChar w:fldCharType="begin"/>
+      </w:r>
+      <w:r>
+        <w:instrText xml:space="preserve"> SEQ Figur \* ARABIC </w:instrText>
+      </w:r>
+      <w:r>
+        <w:fldChar w:fldCharType="separate"/>
+      </w:r>
+      <w:r>
+        <w:rPr>
+          <w:noProof/>
+        </w:rPr>
+        <w:t>3</w:t>
+      </w:r>
+      <w:r>
+        <w:fldChar w:fldCharType="end"/>
+      </w:r>
+      <w:r>
+        <w:t xml:space="preserve"> - Aktivitetsbild</w:t>
+      </w:r>
+    </w:p>
+    <w:p/>
+    <w:p>
+      <w:pPr>
         <w:pStyle w:val="Rubrik2"/>
       </w:pPr>
       <w:bookmarkStart w:id="8" w:name="_Toc103152775"/>
       <w:r>
-        <w:lastRenderedPageBreak/>
         <w:t>Navigering</w:t>
       </w:r>
       <w:bookmarkEnd w:id="8"/>
     </w:p>
+    <w:p/>
     <w:p>
-      <w:r>
-        <w:t xml:space="preserve">Hur navigerar man mellan de olika bilderna </w:t>
-      </w:r>
-      <w:r>
-        <w:t>i programmet</w:t>
-      </w:r>
-      <w:r>
-        <w:t>?</w:t>
+      <w:pPr>
+        <w:keepNext/>
+      </w:pPr>
+      <w:r>
+        <w:rPr>
+          <w:noProof/>
+        </w:rPr>
+        <w:drawing>
+          <wp:inline distT="0" distB="0" distL="0" distR="0" wp14:anchorId="30BE7852" wp14:editId="161ABFC1">
+            <wp:extent cx="2409524" cy="733333"/>
+            <wp:effectExtent l="0" t="0" r="0" b="0"/>
+            <wp:docPr id="1985897965" name="Bildobjekt 1"/>
+            <wp:cNvGraphicFramePr>
+              <a:graphicFrameLocks xmlns:a="http://schemas.openxmlformats.org/drawingml/2006/main" noChangeAspect="1"/>
+            </wp:cNvGraphicFramePr>
+            <a:graphic xmlns:a="http://schemas.openxmlformats.org/drawingml/2006/main">
+              <a:graphicData uri="http://schemas.openxmlformats.org/drawingml/2006/picture">
+                <pic:pic xmlns:pic="http://schemas.openxmlformats.org/drawingml/2006/picture">
+                  <pic:nvPicPr>
+                    <pic:cNvPr id="1985897965" name=""/>
+                    <pic:cNvPicPr/>
+                  </pic:nvPicPr>
+                  <pic:blipFill>
+                    <a:blip r:embed="rId16"/>
+                    <a:stretch>
+                      <a:fillRect/>
+                    </a:stretch>
+                  </pic:blipFill>
+                  <pic:spPr>
+                    <a:xfrm>
+                      <a:off x="0" y="0"/>
+                      <a:ext cx="2409524" cy="733333"/>
+                    </a:xfrm>
+                    <a:prstGeom prst="rect">
+                      <a:avLst/>
+                    </a:prstGeom>
+                  </pic:spPr>
+                </pic:pic>
+              </a:graphicData>
+            </a:graphic>
+          </wp:inline>
+        </w:drawing>
       </w:r>
     </w:p>
+    <w:p>
+      <w:pPr>
+        <w:pStyle w:val="Beskrivning"/>
+      </w:pPr>
+      <w:r>
+        <w:fldChar w:fldCharType="begin"/>
+      </w:r>
+      <w:r>
+        <w:instrText xml:space="preserve"> SEQ Figur \* ARABIC </w:instrText>
+      </w:r>
+      <w:r>
+        <w:fldChar w:fldCharType="separate"/>
+      </w:r>
+      <w:r>
+        <w:rPr>
+          <w:noProof/>
+        </w:rPr>
+        <w:t>4</w:t>
+      </w:r>
+      <w:r>
+        <w:fldChar w:fldCharType="end"/>
+      </w:r>
+      <w:r>
+        <w:t xml:space="preserve"> - Navigeringsfält</w:t>
+      </w:r>
+    </w:p>
+    <w:p>
+      <w:pPr>
+        <w:rPr>
+          <w:lang/>
+        </w:rPr>
+      </w:pPr>
+    </w:p>
+    <w:p/>
+    <w:p/>
+    <w:p/>
     <w:p>
       <w:pPr>
         <w:pStyle w:val="Rubrik2"/>
@@ -1924,8 +2232,420 @@
       <w:bookmarkEnd w:id="9"/>
     </w:p>
     <w:p>
-      <w:r>
-        <w:t>Vilka funktioner finns i programmet?</w:t>
+      <w:pPr>
+        <w:keepNext/>
+      </w:pPr>
+      <w:r>
+        <w:rPr>
+          <w:noProof/>
+        </w:rPr>
+        <w:drawing>
+          <wp:inline distT="0" distB="0" distL="0" distR="0" wp14:anchorId="409A5520" wp14:editId="7BC0881C">
+            <wp:extent cx="1266667" cy="619048"/>
+            <wp:effectExtent l="0" t="0" r="0" b="0"/>
+            <wp:docPr id="171383611" name="Bildobjekt 1"/>
+            <wp:cNvGraphicFramePr>
+              <a:graphicFrameLocks xmlns:a="http://schemas.openxmlformats.org/drawingml/2006/main" noChangeAspect="1"/>
+            </wp:cNvGraphicFramePr>
+            <a:graphic xmlns:a="http://schemas.openxmlformats.org/drawingml/2006/main">
+              <a:graphicData uri="http://schemas.openxmlformats.org/drawingml/2006/picture">
+                <pic:pic xmlns:pic="http://schemas.openxmlformats.org/drawingml/2006/picture">
+                  <pic:nvPicPr>
+                    <pic:cNvPr id="171383611" name=""/>
+                    <pic:cNvPicPr/>
+                  </pic:nvPicPr>
+                  <pic:blipFill>
+                    <a:blip r:embed="rId17"/>
+                    <a:stretch>
+                      <a:fillRect/>
+                    </a:stretch>
+                  </pic:blipFill>
+                  <pic:spPr>
+                    <a:xfrm>
+                      <a:off x="0" y="0"/>
+                      <a:ext cx="1266667" cy="619048"/>
+                    </a:xfrm>
+                    <a:prstGeom prst="rect">
+                      <a:avLst/>
+                    </a:prstGeom>
+                  </pic:spPr>
+                </pic:pic>
+              </a:graphicData>
+            </a:graphic>
+          </wp:inline>
+        </w:drawing>
+      </w:r>
+    </w:p>
+    <w:p>
+      <w:pPr>
+        <w:pStyle w:val="Beskrivning"/>
+        <w:rPr>
+          <w:noProof/>
+        </w:rPr>
+      </w:pPr>
+      <w:r>
+        <w:rPr>
+          <w:noProof/>
+        </w:rPr>
+        <w:fldChar w:fldCharType="begin"/>
+      </w:r>
+      <w:r>
+        <w:rPr>
+          <w:noProof/>
+        </w:rPr>
+        <w:instrText xml:space="preserve"> SEQ Figur \* ARABIC </w:instrText>
+      </w:r>
+      <w:r>
+        <w:rPr>
+          <w:noProof/>
+        </w:rPr>
+        <w:fldChar w:fldCharType="separate"/>
+      </w:r>
+      <w:r>
+        <w:rPr>
+          <w:noProof/>
+        </w:rPr>
+        <w:t>5</w:t>
+      </w:r>
+      <w:r>
+        <w:rPr>
+          <w:noProof/>
+        </w:rPr>
+        <w:fldChar w:fldCharType="end"/>
+      </w:r>
+      <w:r>
+        <w:t xml:space="preserve"> - Knapp för att lägga till </w:t>
+      </w:r>
+      <w:r>
+        <w:t xml:space="preserve">Aktiviteter </w:t>
+      </w:r>
+    </w:p>
+    <w:p>
+      <w:pPr>
+        <w:keepNext/>
+      </w:pPr>
+      <w:r>
+        <w:rPr>
+          <w:lang/>
+        </w:rPr>
+        <w:lastRenderedPageBreak/>
+        <w:drawing>
+          <wp:inline distT="0" distB="0" distL="0" distR="0" wp14:anchorId="6BE162A5" wp14:editId="409246BB">
+            <wp:extent cx="1066800" cy="693420"/>
+            <wp:effectExtent l="0" t="0" r="0" b="0"/>
+            <wp:docPr id="59037158" name="Bildobjekt 5"/>
+            <wp:cNvGraphicFramePr>
+              <a:graphicFrameLocks xmlns:a="http://schemas.openxmlformats.org/drawingml/2006/main" noChangeAspect="1"/>
+            </wp:cNvGraphicFramePr>
+            <a:graphic xmlns:a="http://schemas.openxmlformats.org/drawingml/2006/main">
+              <a:graphicData uri="http://schemas.openxmlformats.org/drawingml/2006/picture">
+                <pic:pic xmlns:pic="http://schemas.openxmlformats.org/drawingml/2006/picture">
+                  <pic:nvPicPr>
+                    <pic:cNvPr id="0" name="Picture 10"/>
+                    <pic:cNvPicPr>
+                      <a:picLocks noChangeAspect="1" noChangeArrowheads="1"/>
+                    </pic:cNvPicPr>
+                  </pic:nvPicPr>
+                  <pic:blipFill>
+                    <a:blip r:embed="rId18">
+                      <a:extLst>
+                        <a:ext uri="{28A0092B-C50C-407E-A947-70E740481C1C}">
+                          <a14:useLocalDpi xmlns:a14="http://schemas.microsoft.com/office/drawing/2010/main" val="0"/>
+                        </a:ext>
+                      </a:extLst>
+                    </a:blip>
+                    <a:srcRect/>
+                    <a:stretch>
+                      <a:fillRect/>
+                    </a:stretch>
+                  </pic:blipFill>
+                  <pic:spPr bwMode="auto">
+                    <a:xfrm>
+                      <a:off x="0" y="0"/>
+                      <a:ext cx="1066800" cy="693420"/>
+                    </a:xfrm>
+                    <a:prstGeom prst="rect">
+                      <a:avLst/>
+                    </a:prstGeom>
+                    <a:noFill/>
+                    <a:ln>
+                      <a:noFill/>
+                    </a:ln>
+                  </pic:spPr>
+                </pic:pic>
+              </a:graphicData>
+            </a:graphic>
+          </wp:inline>
+        </w:drawing>
+      </w:r>
+    </w:p>
+    <w:p>
+      <w:pPr>
+        <w:pStyle w:val="Beskrivning"/>
+      </w:pPr>
+      <w:r>
+        <w:fldChar w:fldCharType="begin"/>
+      </w:r>
+      <w:r>
+        <w:instrText xml:space="preserve"> SEQ Figur \* ARABIC </w:instrText>
+      </w:r>
+      <w:r>
+        <w:fldChar w:fldCharType="separate"/>
+      </w:r>
+      <w:r>
+        <w:rPr>
+          <w:noProof/>
+        </w:rPr>
+        <w:t>6</w:t>
+      </w:r>
+      <w:r>
+        <w:fldChar w:fldCharType="end"/>
+      </w:r>
+      <w:r>
+        <w:t xml:space="preserve"> - Knapp för att ändra och en till knapp för att radera innehåll</w:t>
+      </w:r>
+    </w:p>
+    <w:p>
+      <w:pPr>
+        <w:rPr>
+          <w:noProof/>
+        </w:rPr>
+      </w:pPr>
+      <w:r>
+        <w:rPr>
+          <w:noProof/>
+        </w:rPr>
+        <w:t xml:space="preserve"> </w:t>
+      </w:r>
+    </w:p>
+    <w:p>
+      <w:pPr>
+        <w:keepNext/>
+      </w:pPr>
+      <w:r>
+        <w:rPr>
+          <w:noProof/>
+        </w:rPr>
+        <w:drawing>
+          <wp:inline distT="0" distB="0" distL="0" distR="0" wp14:anchorId="181DA2E2" wp14:editId="43FE6C1A">
+            <wp:extent cx="3323809" cy="2600000"/>
+            <wp:effectExtent l="0" t="0" r="0" b="0"/>
+            <wp:docPr id="5999805" name="Bildobjekt 1"/>
+            <wp:cNvGraphicFramePr>
+              <a:graphicFrameLocks xmlns:a="http://schemas.openxmlformats.org/drawingml/2006/main" noChangeAspect="1"/>
+            </wp:cNvGraphicFramePr>
+            <a:graphic xmlns:a="http://schemas.openxmlformats.org/drawingml/2006/main">
+              <a:graphicData uri="http://schemas.openxmlformats.org/drawingml/2006/picture">
+                <pic:pic xmlns:pic="http://schemas.openxmlformats.org/drawingml/2006/picture">
+                  <pic:nvPicPr>
+                    <pic:cNvPr id="5999805" name=""/>
+                    <pic:cNvPicPr/>
+                  </pic:nvPicPr>
+                  <pic:blipFill>
+                    <a:blip r:embed="rId19"/>
+                    <a:stretch>
+                      <a:fillRect/>
+                    </a:stretch>
+                  </pic:blipFill>
+                  <pic:spPr>
+                    <a:xfrm>
+                      <a:off x="0" y="0"/>
+                      <a:ext cx="3323809" cy="2600000"/>
+                    </a:xfrm>
+                    <a:prstGeom prst="rect">
+                      <a:avLst/>
+                    </a:prstGeom>
+                  </pic:spPr>
+                </pic:pic>
+              </a:graphicData>
+            </a:graphic>
+          </wp:inline>
+        </w:drawing>
+      </w:r>
+    </w:p>
+    <w:p>
+      <w:pPr>
+        <w:pStyle w:val="Beskrivning"/>
+      </w:pPr>
+      <w:r>
+        <w:fldChar w:fldCharType="begin"/>
+      </w:r>
+      <w:r>
+        <w:instrText xml:space="preserve"> SEQ Figur \* ARABIC </w:instrText>
+      </w:r>
+      <w:r>
+        <w:fldChar w:fldCharType="separate"/>
+      </w:r>
+      <w:r>
+        <w:rPr>
+          <w:noProof/>
+        </w:rPr>
+        <w:t>7</w:t>
+      </w:r>
+      <w:r>
+        <w:fldChar w:fldCharType="end"/>
+      </w:r>
+      <w:r>
+        <w:t xml:space="preserve"> - </w:t>
+      </w:r>
+      <w:proofErr w:type="spellStart"/>
+      <w:r>
+        <w:t>Pie-chart</w:t>
+      </w:r>
+      <w:proofErr w:type="spellEnd"/>
+      <w:r>
+        <w:t xml:space="preserve"> i aktivitetsövervakaren</w:t>
+      </w:r>
+    </w:p>
+    <w:p>
+      <w:pPr>
+        <w:keepNext/>
+      </w:pPr>
+      <w:r>
+        <w:rPr>
+          <w:noProof/>
+        </w:rPr>
+        <w:drawing>
+          <wp:inline distT="0" distB="0" distL="0" distR="0" wp14:anchorId="24B74A63" wp14:editId="26AD8392">
+            <wp:extent cx="4200000" cy="2676190"/>
+            <wp:effectExtent l="0" t="0" r="0" b="0"/>
+            <wp:docPr id="638030584" name="Bildobjekt 1"/>
+            <wp:cNvGraphicFramePr>
+              <a:graphicFrameLocks xmlns:a="http://schemas.openxmlformats.org/drawingml/2006/main" noChangeAspect="1"/>
+            </wp:cNvGraphicFramePr>
+            <a:graphic xmlns:a="http://schemas.openxmlformats.org/drawingml/2006/main">
+              <a:graphicData uri="http://schemas.openxmlformats.org/drawingml/2006/picture">
+                <pic:pic xmlns:pic="http://schemas.openxmlformats.org/drawingml/2006/picture">
+                  <pic:nvPicPr>
+                    <pic:cNvPr id="638030584" name=""/>
+                    <pic:cNvPicPr/>
+                  </pic:nvPicPr>
+                  <pic:blipFill>
+                    <a:blip r:embed="rId20"/>
+                    <a:stretch>
+                      <a:fillRect/>
+                    </a:stretch>
+                  </pic:blipFill>
+                  <pic:spPr>
+                    <a:xfrm>
+                      <a:off x="0" y="0"/>
+                      <a:ext cx="4200000" cy="2676190"/>
+                    </a:xfrm>
+                    <a:prstGeom prst="rect">
+                      <a:avLst/>
+                    </a:prstGeom>
+                  </pic:spPr>
+                </pic:pic>
+              </a:graphicData>
+            </a:graphic>
+          </wp:inline>
+        </w:drawing>
+      </w:r>
+    </w:p>
+    <w:p>
+      <w:pPr>
+        <w:pStyle w:val="Beskrivning"/>
+      </w:pPr>
+      <w:r>
+        <w:fldChar w:fldCharType="begin"/>
+      </w:r>
+      <w:r>
+        <w:instrText xml:space="preserve"> SEQ Figur \* ARABIC </w:instrText>
+      </w:r>
+      <w:r>
+        <w:fldChar w:fldCharType="separate"/>
+      </w:r>
+      <w:r>
+        <w:rPr>
+          <w:noProof/>
+        </w:rPr>
+        <w:t>8</w:t>
+      </w:r>
+      <w:r>
+        <w:fldChar w:fldCharType="end"/>
+      </w:r>
+      <w:r>
+        <w:t xml:space="preserve"> - Information om uppgifter, spenderad tid och datum när uppgiften klargjordes</w:t>
+      </w:r>
+    </w:p>
+    <w:p>
+      <w:pPr>
+        <w:keepNext/>
+      </w:pPr>
+      <w:r>
+        <w:rPr>
+          <w:noProof/>
+        </w:rPr>
+        <w:lastRenderedPageBreak/>
+        <w:drawing>
+          <wp:inline distT="0" distB="0" distL="0" distR="0" wp14:anchorId="2902157D" wp14:editId="173FFD4C">
+            <wp:extent cx="5478780" cy="2904490"/>
+            <wp:effectExtent l="0" t="0" r="7620" b="0"/>
+            <wp:docPr id="1877856909" name="Bildobjekt 1"/>
+            <wp:cNvGraphicFramePr>
+              <a:graphicFrameLocks xmlns:a="http://schemas.openxmlformats.org/drawingml/2006/main" noChangeAspect="1"/>
+            </wp:cNvGraphicFramePr>
+            <a:graphic xmlns:a="http://schemas.openxmlformats.org/drawingml/2006/main">
+              <a:graphicData uri="http://schemas.openxmlformats.org/drawingml/2006/picture">
+                <pic:pic xmlns:pic="http://schemas.openxmlformats.org/drawingml/2006/picture">
+                  <pic:nvPicPr>
+                    <pic:cNvPr id="1877856909" name=""/>
+                    <pic:cNvPicPr/>
+                  </pic:nvPicPr>
+                  <pic:blipFill>
+                    <a:blip r:embed="rId21"/>
+                    <a:stretch>
+                      <a:fillRect/>
+                    </a:stretch>
+                  </pic:blipFill>
+                  <pic:spPr>
+                    <a:xfrm>
+                      <a:off x="0" y="0"/>
+                      <a:ext cx="5478780" cy="2904490"/>
+                    </a:xfrm>
+                    <a:prstGeom prst="rect">
+                      <a:avLst/>
+                    </a:prstGeom>
+                  </pic:spPr>
+                </pic:pic>
+              </a:graphicData>
+            </a:graphic>
+          </wp:inline>
+        </w:drawing>
+      </w:r>
+    </w:p>
+    <w:p>
+      <w:pPr>
+        <w:pStyle w:val="Beskrivning"/>
+      </w:pPr>
+      <w:r>
+        <w:fldChar w:fldCharType="begin"/>
+      </w:r>
+      <w:r>
+        <w:instrText xml:space="preserve"> SEQ Figur \* ARABIC </w:instrText>
+      </w:r>
+      <w:r>
+        <w:fldChar w:fldCharType="separate"/>
+      </w:r>
+      <w:r>
+        <w:rPr>
+          <w:noProof/>
+        </w:rPr>
+        <w:t>9</w:t>
+      </w:r>
+      <w:r>
+        <w:fldChar w:fldCharType="end"/>
+      </w:r>
+      <w:r>
+        <w:t xml:space="preserve"> - </w:t>
+      </w:r>
+      <w:proofErr w:type="spellStart"/>
+      <w:r>
+        <w:t>graph</w:t>
+      </w:r>
+      <w:proofErr w:type="spellEnd"/>
+      <w:r>
+        <w:t xml:space="preserve"> översikt över uppgifter</w:t>
       </w:r>
     </w:p>
     <w:p>
@@ -1990,6 +2710,9 @@
     </w:p>
     <w:p>
       <w:r>
+        <w:rPr>
+          <w:noProof/>
+        </w:rPr>
         <w:drawing>
           <wp:inline distT="0" distB="0" distL="0" distR="0" wp14:anchorId="3EC41476" wp14:editId="66F5AA4D">
             <wp:extent cx="5478780" cy="2546350"/>
@@ -2006,7 +2729,7 @@
                     <pic:cNvPicPr/>
                   </pic:nvPicPr>
                   <pic:blipFill>
-                    <a:blip r:embed="rId13"/>
+                    <a:blip r:embed="rId22"/>
                     <a:stretch>
                       <a:fillRect/>
                     </a:stretch>
@@ -2034,13 +2757,22 @@
       <w:bookmarkStart w:id="12" w:name="_Toc103152780"/>
       <w:bookmarkStart w:id="13" w:name="_Toc103152779"/>
       <w:r>
+        <w:lastRenderedPageBreak/>
         <w:t>Tabellbeskrivningar</w:t>
       </w:r>
       <w:bookmarkEnd w:id="12"/>
     </w:p>
     <w:p>
       <w:r>
-        <w:t xml:space="preserve">Databasen har två tabeller aktiviteter och uppgifter, tabellen aktiviteter består av två fält ett id som är </w:t>
+        <w:t xml:space="preserve">Databasen har två tabeller aktiviteter och uppgifter, tabellen aktiviteter består av två fält </w:t>
+      </w:r>
+      <w:proofErr w:type="gramStart"/>
+      <w:r>
+        <w:t>ett id</w:t>
+      </w:r>
+      <w:proofErr w:type="gramEnd"/>
+      <w:r>
+        <w:t xml:space="preserve"> som är </w:t>
       </w:r>
       <w:proofErr w:type="spellStart"/>
       <w:r>
@@ -2048,7 +2780,15 @@
       </w:r>
       <w:proofErr w:type="spellEnd"/>
       <w:r>
-        <w:t xml:space="preserve"> heltal och ett namn, som är ett unikt index tabellen uppgifter har också ett id som är ett </w:t>
+        <w:t xml:space="preserve"> heltal och ett namn, som är ett unikt index tabellen uppgifter har också </w:t>
+      </w:r>
+      <w:proofErr w:type="gramStart"/>
+      <w:r>
+        <w:t>ett id</w:t>
+      </w:r>
+      <w:proofErr w:type="gramEnd"/>
+      <w:r>
+        <w:t xml:space="preserve"> som är ett </w:t>
       </w:r>
       <w:proofErr w:type="spellStart"/>
       <w:r>
@@ -2056,13 +2796,26 @@
       </w:r>
       <w:proofErr w:type="spellEnd"/>
       <w:r>
-        <w:t xml:space="preserve"> heltal datum sparas som i datumformatet år-månad-dag(</w:t>
+        <w:t xml:space="preserve"> </w:t>
+      </w:r>
+      <w:proofErr w:type="gramStart"/>
+      <w:r>
+        <w:t>heltal datum</w:t>
+      </w:r>
+      <w:proofErr w:type="gramEnd"/>
+      <w:r>
+        <w:t xml:space="preserve"> sparas som i datumformatet år-månad-</w:t>
+      </w:r>
+      <w:proofErr w:type="gramStart"/>
+      <w:r>
+        <w:t>dag(</w:t>
       </w:r>
       <w:proofErr w:type="spellStart"/>
       <w:r>
         <w:t>t.ex</w:t>
       </w:r>
       <w:proofErr w:type="spellEnd"/>
+      <w:proofErr w:type="gramEnd"/>
       <w:r>
         <w:t xml:space="preserve"> 2026-04-22), varaktigheten sparas i timmar och minuter (11:15) eftersom </w:t>
       </w:r>
@@ -2130,7 +2883,6 @@
       </w:pPr>
       <w:bookmarkStart w:id="14" w:name="_Toc103152781"/>
       <w:r>
-        <w:lastRenderedPageBreak/>
         <w:t>Säkerhet</w:t>
       </w:r>
       <w:bookmarkEnd w:id="14"/>
@@ -2217,7 +2969,7 @@
       </w:r>
     </w:p>
     <w:sectPr>
-      <w:footerReference w:type="default" r:id="rId14"/>
+      <w:footerReference w:type="default" r:id="rId23"/>
       <w:pgSz w:w="11906" w:h="16838" w:code="9"/>
       <w:pgMar w:top="1440" w:right="1639" w:bottom="1440" w:left="1639" w:header="720" w:footer="720" w:gutter="0"/>
       <w:pgNumType w:start="0"/>
@@ -3653,7 +4405,6 @@
   <w:style w:type="character" w:default="1" w:styleId="Standardstycketeckensnitt">
     <w:name w:val="Default Paragraph Font"/>
     <w:uiPriority w:val="1"/>
-    <w:semiHidden/>
     <w:unhideWhenUsed/>
   </w:style>
   <w:style w:type="table" w:default="1" w:styleId="Normaltabell">
@@ -3968,7 +4719,6 @@
     <w:basedOn w:val="Normal"/>
     <w:next w:val="Normal"/>
     <w:uiPriority w:val="2"/>
-    <w:semiHidden/>
     <w:unhideWhenUsed/>
     <w:qFormat/>
     <w:rsid w:val="00A122DB"/>
@@ -4759,7 +5509,7 @@
     <w:charset w:val="00"/>
     <w:family w:val="modern"/>
     <w:pitch w:val="fixed"/>
-    <w:sig w:usb0="E00002FF" w:usb1="0000FCFF" w:usb2="00000001" w:usb3="00000000" w:csb0="0000019F" w:csb1="00000000"/>
+    <w:sig w:usb0="E00006FF" w:usb1="0000FCFF" w:usb2="00000001" w:usb3="00000000" w:csb0="0000019F" w:csb1="00000000"/>
   </w:font>
   <w:font w:name="Aptos">
     <w:charset w:val="00"/>
@@ -4822,6 +5572,8 @@
   <w:rsids>
     <w:rsidRoot w:val="00BF00B4"/>
     <w:rsid w:val="001E75FC"/>
+    <w:rsid w:val="005A5275"/>
+    <w:rsid w:val="007A07A7"/>
     <w:rsid w:val="007D257D"/>
     <w:rsid w:val="008A39E9"/>
     <w:rsid w:val="00A34B80"/>
@@ -5598,25 +6350,6 @@
 </file>
 
 <file path=customXml/item1.xml><?xml version="1.0" encoding="utf-8"?>
-<?mso-contentType ?>
-<FormTemplates xmlns="http://schemas.microsoft.com/sharepoint/v3/contenttype/forms">
-  <Display>DocumentLibraryForm</Display>
-  <Edit>DocumentLibraryForm</Edit>
-  <New>DocumentLibraryForm</New>
-</FormTemplates>
-</file>
-
-<file path=customXml/item2.xml><?xml version="1.0" encoding="utf-8"?>
-<p:properties xmlns:p="http://schemas.microsoft.com/office/2006/metadata/properties" xmlns:xsi="http://www.w3.org/2001/XMLSchema-instance" xmlns:pc="http://schemas.microsoft.com/office/infopath/2007/PartnerControls">
-  <documentManagement/>
-</p:properties>
-</file>
-
-<file path=customXml/item3.xml><?xml version="1.0" encoding="utf-8"?>
-<b:Sources xmlns:b="http://schemas.openxmlformats.org/officeDocument/2006/bibliography" xmlns="http://schemas.openxmlformats.org/officeDocument/2006/bibliography" SelectedStyle="\APASixthEditionOfficeOnline.xsl" StyleName="APA" Version="6"/>
-</file>
-
-<file path=customXml/item4.xml><?xml version="1.0" encoding="utf-8"?>
 <ct:contentTypeSchema xmlns:ct="http://schemas.microsoft.com/office/2006/metadata/contentType" xmlns:ma="http://schemas.microsoft.com/office/2006/metadata/properties/metaAttributes" ct:_="" ma:_="" ma:contentTypeName="dokument" ma:contentTypeID="0x01010067B035B7DE360F49AC1E3E64A7BD4266" ma:contentTypeVersion="9" ma:contentTypeDescription="Skapa ett nytt dokument." ma:contentTypeScope="" ma:versionID="2b15be16484cc4125e56b4bc62a7d78a">
   <xsd:schema xmlns:xsd="http://www.w3.org/2001/XMLSchema" xmlns:xs="http://www.w3.org/2001/XMLSchema" xmlns:p="http://schemas.microsoft.com/office/2006/metadata/properties" xmlns:ns3="e726d1de-8eee-48d4-acc6-11f5952e6685" xmlns:ns4="7afd1d53-ab43-4087-8ee5-8d1641b94b01" targetNamespace="http://schemas.microsoft.com/office/2006/metadata/properties" ma:root="true" ma:fieldsID="07a74a5b6f94ee7a3fc8de3bd0e980eb" ns3:_="" ns4:_="">
     <xsd:import namespace="e726d1de-8eee-48d4-acc6-11f5952e6685"/>
@@ -5813,32 +6546,26 @@
 </ct:contentTypeSchema>
 </file>
 
-<file path=customXml/itemProps1.xml><?xml version="1.0" encoding="utf-8"?>
-<ds:datastoreItem xmlns:ds="http://schemas.openxmlformats.org/officeDocument/2006/customXml" ds:itemID="{9DD392A4-9C7B-47E9-A2A7-2EC9259DC515}">
-  <ds:schemaRefs>
-    <ds:schemaRef ds:uri="http://schemas.microsoft.com/sharepoint/v3/contenttype/forms"/>
-  </ds:schemaRefs>
-</ds:datastoreItem>
+<file path=customXml/item2.xml><?xml version="1.0" encoding="utf-8"?>
+<b:Sources xmlns:b="http://schemas.openxmlformats.org/officeDocument/2006/bibliography" xmlns="http://schemas.openxmlformats.org/officeDocument/2006/bibliography" SelectedStyle="\APASixthEditionOfficeOnline.xsl" StyleName="APA" Version="6"/>
 </file>
 
-<file path=customXml/itemProps2.xml><?xml version="1.0" encoding="utf-8"?>
-<ds:datastoreItem xmlns:ds="http://schemas.openxmlformats.org/officeDocument/2006/customXml" ds:itemID="{12E72A48-7A3C-4AA9-A41C-71D022C7FFC5}">
-  <ds:schemaRefs>
-    <ds:schemaRef ds:uri="http://schemas.microsoft.com/office/2006/metadata/properties"/>
-    <ds:schemaRef ds:uri="http://schemas.microsoft.com/office/infopath/2007/PartnerControls"/>
-  </ds:schemaRefs>
-</ds:datastoreItem>
+<file path=customXml/item3.xml><?xml version="1.0" encoding="utf-8"?>
+<p:properties xmlns:p="http://schemas.microsoft.com/office/2006/metadata/properties" xmlns:xsi="http://www.w3.org/2001/XMLSchema-instance" xmlns:pc="http://schemas.microsoft.com/office/infopath/2007/PartnerControls">
+  <documentManagement/>
+</p:properties>
 </file>
 
-<file path=customXml/itemProps3.xml><?xml version="1.0" encoding="utf-8"?>
-<ds:datastoreItem xmlns:ds="http://schemas.openxmlformats.org/officeDocument/2006/customXml" ds:itemID="{F95BC9C0-4309-42B6-A692-27E3D4821FE6}">
-  <ds:schemaRefs>
-    <ds:schemaRef ds:uri="http://schemas.openxmlformats.org/officeDocument/2006/bibliography"/>
-  </ds:schemaRefs>
-</ds:datastoreItem>
+<file path=customXml/item4.xml><?xml version="1.0" encoding="utf-8"?>
+<?mso-contentType ?>
+<FormTemplates xmlns="http://schemas.microsoft.com/sharepoint/v3/contenttype/forms">
+  <Display>DocumentLibraryForm</Display>
+  <Edit>DocumentLibraryForm</Edit>
+  <New>DocumentLibraryForm</New>
+</FormTemplates>
 </file>
 
-<file path=customXml/itemProps4.xml><?xml version="1.0" encoding="utf-8"?>
+<file path=customXml/itemProps1.xml><?xml version="1.0" encoding="utf-8"?>
 <ds:datastoreItem xmlns:ds="http://schemas.openxmlformats.org/officeDocument/2006/customXml" ds:itemID="{9E68415D-8571-4C4E-9D5B-26AF09ED893B}">
   <ds:schemaRefs>
     <ds:schemaRef ds:uri="http://schemas.microsoft.com/office/2006/metadata/contentType"/>
@@ -5855,4 +6582,29 @@
     <ds:schemaRef ds:uri="http://schemas.microsoft.com/internal/obd"/>
   </ds:schemaRefs>
 </ds:datastoreItem>
+</file>
+
+<file path=customXml/itemProps2.xml><?xml version="1.0" encoding="utf-8"?>
+<ds:datastoreItem xmlns:ds="http://schemas.openxmlformats.org/officeDocument/2006/customXml" ds:itemID="{F95BC9C0-4309-42B6-A692-27E3D4821FE6}">
+  <ds:schemaRefs>
+    <ds:schemaRef ds:uri="http://schemas.openxmlformats.org/officeDocument/2006/bibliography"/>
+  </ds:schemaRefs>
+</ds:datastoreItem>
+</file>
+
+<file path=customXml/itemProps3.xml><?xml version="1.0" encoding="utf-8"?>
+<ds:datastoreItem xmlns:ds="http://schemas.openxmlformats.org/officeDocument/2006/customXml" ds:itemID="{12E72A48-7A3C-4AA9-A41C-71D022C7FFC5}">
+  <ds:schemaRefs>
+    <ds:schemaRef ds:uri="http://schemas.microsoft.com/office/2006/metadata/properties"/>
+    <ds:schemaRef ds:uri="http://schemas.microsoft.com/office/infopath/2007/PartnerControls"/>
+  </ds:schemaRefs>
+</ds:datastoreItem>
+</file>
+
+<file path=customXml/itemProps4.xml><?xml version="1.0" encoding="utf-8"?>
+<ds:datastoreItem xmlns:ds="http://schemas.openxmlformats.org/officeDocument/2006/customXml" ds:itemID="{9DD392A4-9C7B-47E9-A2A7-2EC9259DC515}">
+  <ds:schemaRefs>
+    <ds:schemaRef ds:uri="http://schemas.microsoft.com/sharepoint/v3/contenttype/forms"/>
+  </ds:schemaRefs>
+</ds:datastoreItem>
 </file>
</xml_diff>